<commit_message>
docs: refresh local demo guide and 1000-message evidence
</commit_message>
<xml_diff>
--- a/docs/ERP-WMS-User-Guide.docx
+++ b/docs/ERP-WMS-User-Guide.docx
@@ -63,7 +63,7 @@
         <w:pStyle w:val="ListBullet"/>
       </w:pPr>
       <w:r>
-        <w:t>The SQL host MOBILE27 must be reachable on the configured network. RDP connectivity alone does not prove that SQL is reachable.</w:t>
+        <w:t>The local SQL Server instance .\SQLDEVELOPER must be running. The application uses CapstoneErp and CapstoneWms on this computer; no remote SQL host is required.</w:t>
       </w:r>
     </w:p>
     <w:p>
@@ -93,7 +93,7 @@
     <w:p>
       <w:pPr/>
       <w:r>
-        <w:t>The screenshots show the implemented dashboard and results retained from the 23 September browser session. During preparation on 24 September, MOBILE27 was on another network and services could not become ready. These are captured examples, not a new live verification run. Identifiers and material codes are synthetic demonstration data.</w:t>
+        <w:t>All screenshots were captured from the local environment on 24 September 2026. The guide distinguishes the 1000-message ERP to WMS delivery run from the separate 1000-message custom validation batch. Both use synthetic data and 30 percent intentional errors. The displayed results are actual recorded outcomes, not mockups.</w:t>
       </w:r>
     </w:p>
     <w:p>
@@ -179,7 +179,7 @@
       <w:r>
         <w:drawing>
           <wp:inline xmlns:a="http://schemas.openxmlformats.org/drawingml/2006/main" xmlns:pic="http://schemas.openxmlformats.org/drawingml/2006/picture">
-            <wp:extent cx="6035040" cy="2206536"/>
+            <wp:extent cx="6035040" cy="1666071"/>
             <wp:docPr id="1" name="Picture 1"/>
             <wp:cNvGraphicFramePr>
               <a:graphicFrameLocks noChangeAspect="1"/>
@@ -200,7 +200,7 @@
                   <pic:spPr>
                     <a:xfrm>
                       <a:off x="0" y="0"/>
-                      <a:ext cx="6035040" cy="2206536"/>
+                      <a:ext cx="6035040" cy="1666071"/>
                     </a:xfrm>
                     <a:prstGeom prst="rect"/>
                   </pic:spPr>
@@ -216,7 +216,7 @@
         <w:pStyle w:val="Caption"/>
       </w:pPr>
       <w:r>
-        <w:t>Figure 1. Connection panel and delivery path. The browser requires a key before Connect can proceed.</w:t>
+        <w:t>Figure 1. Authenticated local dashboard session and ERP to WMS delivery path. The API key is masked.</w:t>
       </w:r>
     </w:p>
     <w:p>
@@ -285,7 +285,7 @@
       <w:r>
         <w:drawing>
           <wp:inline xmlns:a="http://schemas.openxmlformats.org/drawingml/2006/main" xmlns:pic="http://schemas.openxmlformats.org/drawingml/2006/picture">
-            <wp:extent cx="6035040" cy="2577036"/>
+            <wp:extent cx="6035040" cy="2245263"/>
             <wp:docPr id="2" name="Picture 2"/>
             <wp:cNvGraphicFramePr>
               <a:graphicFrameLocks noChangeAspect="1"/>
@@ -306,7 +306,7 @@
                   <pic:spPr>
                     <a:xfrm>
                       <a:off x="0" y="0"/>
-                      <a:ext cx="6035040" cy="2577036"/>
+                      <a:ext cx="6035040" cy="2245263"/>
                     </a:xfrm>
                     <a:prstGeom prst="rect"/>
                   </pic:spPr>
@@ -322,7 +322,7 @@
         <w:pStyle w:val="Caption"/>
       </w:pPr>
       <w:r>
-        <w:t>Figure 2. Recorded evidence with one order and one receipt after a quantity conflict was rejected.</w:t>
+        <w:t>Figure 2. Fresh local evidence for a delivered batch order: one warehouse order and one receipt after a quantity conflict was rejected.</w:t>
       </w:r>
     </w:p>
     <w:p>
@@ -403,7 +403,7 @@
       <w:r>
         <w:drawing>
           <wp:inline xmlns:a="http://schemas.openxmlformats.org/drawingml/2006/main" xmlns:pic="http://schemas.openxmlformats.org/drawingml/2006/picture">
-            <wp:extent cx="4572000" cy="3761141"/>
+            <wp:extent cx="4572000" cy="3602346"/>
             <wp:docPr id="3" name="Picture 3"/>
             <wp:cNvGraphicFramePr>
               <a:graphicFrameLocks noChangeAspect="1"/>
@@ -424,7 +424,7 @@
                   <pic:spPr>
                     <a:xfrm>
                       <a:off x="0" y="0"/>
-                      <a:ext cx="4572000" cy="3761141"/>
+                      <a:ext cx="4572000" cy="3602346"/>
                     </a:xfrm>
                     <a:prstGeom prst="rect"/>
                   </pic:spPr>
@@ -440,7 +440,7 @@
         <w:pStyle w:val="Caption"/>
       </w:pPr>
       <w:r>
-        <w:t>Figure 3. Sender controls before arming. Buttons are disabled here because the session is disconnected.</w:t>
+        <w:t>Figure 3. Completed local 1000-message delivery run with 700 acknowledgements, 300 expected rejections and zero unexpected outcomes.</w:t>
       </w:r>
     </w:p>
     <w:p>
@@ -465,7 +465,7 @@
     <w:p>
       <w:pPr/>
       <w:r>
-        <w:t>The RQSM example contains a Header identifier, a Destination area, and Details fields for quantity and material. Reusing a section name groups its fields together.</w:t>
+        <w:t>The GuideWarehouseNotice example contains a Header identifier, a Destination area, and Details fields for quantity and material. Reusing a section name groups its fields together.</w:t>
       </w:r>
     </w:p>
     <w:p>
@@ -507,7 +507,7 @@
       <w:r>
         <w:drawing>
           <wp:inline xmlns:a="http://schemas.openxmlformats.org/drawingml/2006/main" xmlns:pic="http://schemas.openxmlformats.org/drawingml/2006/picture">
-            <wp:extent cx="4572000" cy="3898363"/>
+            <wp:extent cx="4572000" cy="3336910"/>
             <wp:docPr id="4" name="Picture 4"/>
             <wp:cNvGraphicFramePr>
               <a:graphicFrameLocks noChangeAspect="1"/>
@@ -528,7 +528,7 @@
                   <pic:spPr>
                     <a:xfrm>
                       <a:off x="0" y="0"/>
-                      <a:ext cx="4572000" cy="3898363"/>
+                      <a:ext cx="4572000" cy="3336910"/>
                     </a:xfrm>
                     <a:prstGeom prst="rect"/>
                   </pic:spPr>
@@ -544,7 +544,7 @@
         <w:pStyle w:val="Caption"/>
       </w:pPr>
       <w:r>
-        <w:t>Figure 4. RQSM version 1 groups four fields into three sections. Example material choices are box, hb1 and to0.</w:t>
+        <w:t>Figure 4. GuideWarehouseNotice version 1 groups four fields into three sections. Example material choices are BOX, PALLET and CARTON.</w:t>
       </w:r>
     </w:p>
     <w:p>
@@ -597,7 +597,7 @@
       <w:r>
         <w:drawing>
           <wp:inline xmlns:a="http://schemas.openxmlformats.org/drawingml/2006/main" xmlns:pic="http://schemas.openxmlformats.org/drawingml/2006/picture">
-            <wp:extent cx="6035040" cy="4157838"/>
+            <wp:extent cx="6035040" cy="3668217"/>
             <wp:docPr id="5" name="Picture 5"/>
             <wp:cNvGraphicFramePr>
               <a:graphicFrameLocks noChangeAspect="1"/>
@@ -618,7 +618,7 @@
                   <pic:spPr>
                     <a:xfrm>
                       <a:off x="0" y="0"/>
-                      <a:ext cx="6035040" cy="4157838"/>
+                      <a:ext cx="6035040" cy="3668217"/>
                     </a:xfrm>
                     <a:prstGeom prst="rect"/>
                   </pic:spPr>
@@ -634,7 +634,7 @@
         <w:pStyle w:val="Caption"/>
       </w:pPr>
       <w:r>
-        <w:t>Figure 5. Captured RQSM batch with 1000 messages, 500 valid, 500 rejected and zero unexpected results at 50 percent injection.</w:t>
+        <w:t>Figure 5. Local custom validation batch with 1000 messages, 700 valid, 300 rejected and zero unexpected results at 30 percent injection.</w:t>
       </w:r>
     </w:p>
     <w:p>
@@ -681,7 +681,7 @@
         <w:pStyle w:val="ListBullet"/>
       </w:pPr>
       <w:r>
-        <w:t>ERP unavailable or page unreachable: first confirm MOBILE27 is reachable on the configured SQL network, then run Start-Demo. A cached page is not proof of running services.</w:t>
+        <w:t>ERP unavailable or page unreachable: confirm SQL Server (SQLDEVELOPER) is running locally, then run Start-Demo. A cached page is not proof of running services.</w:t>
       </w:r>
     </w:p>
     <w:p>
@@ -783,7 +783,7 @@
     <w:p>
       <w:pPr/>
       <w:r>
-        <w:t>The implementation checkpoint passed 44 unit tests and 60 HTTP/SQL assertions before this documentation session. They cover validation, versions, generated outcomes, source isolation and the existing order flow. They were not rerun with MOBILE27 on a different network.</w:t>
+        <w:t>The implementation checkpoint passed 44 unit tests. After deployment to local SQL, 60 HTTP/SQL assertions and automatic-sender checks passed. This guide adds two fresh 1000-message batches: an ERP to WMS delivery run and a custom validation run. Batch details and identities are listed in the accompanying local verification record.</w:t>
       </w:r>
     </w:p>
     <w:p>

</xml_diff>